<commit_message>
Bổ sung luồng Salary Decision List (US-09) và Screens Hierarchy
- User Stories: US-06 làm rõ 2 lối vào tạo quyết định, thêm US-09
  (list + resume draft), rule 1 đợt tối đa 1 quyết định chưa hủy
- Information Architecture: thêm trang Salary Decision List làm parent
  thật của Create/Edit Salary Decision
- Wireframe (EN+VI): thêm Screen mới "Salary Decision List", đánh lại
  số các Screen sau, nêu rõ 2 lối vào ở Screen Create/Edit Decision
- Thêm Docs/UI-UX/ScreensHierarchy_SalaryGradePromotion.md: liệt kê
  đủ page/modal/dialog và hành động chuyển màn, kế thừa từ IA
- OpenAPI: làm rõ mô tả GET /salary-decisions (US-09), thêm case 409
  trùng quyết định, thêm field decisionId vào ReviewPeriodDetail
- Arc42 Runtime View: bước 5 nêu rõ 2 lối vào tạo quyết định
- DetailedDesign: thêm Sequence Diagram #5 (list/start/resume decision)
- arc42-lint PASS, openapi.yaml hợp lệ
</commit_message>
<xml_diff>
--- a/Docs/UI-UX/HRM_Salary_Grade_Promotion_Wireframe_UIUX_EN.docx
+++ b/Docs/UI-UX/HRM_Salary_Grade_Promotion_Wireframe_UIUX_EN.docx
@@ -235,6 +235,11 @@
       </w:r>
     </w:p>
     <w:p>
+      <w:r>
+        <w:t>Once the period's Status is Submitted, a "Create Decision" button appears; it opens the Create/Edit Salary Decision screen (Screen 5) with this review period already selected. If a non-cancelled decision already exists for this period, the button instead says "View Decision" and opens that decision.</w:t>
+      </w:r>
+    </w:p>
+    <w:p>
       <w:pPr>
         <w:pStyle w:val="ListBullet"/>
       </w:pPr>
@@ -380,11 +385,62 @@
       </w:r>
     </w:p>
     <w:p>
+      <w:r>
+        <w:t>4. Screen 4 - Salary Decision List (Approver)</w:t>
+      </w:r>
+    </w:p>
+    <w:p/>
+    <w:p>
+      <w:r>
+        <w:t>Main Behavior</w:t>
+      </w:r>
+    </w:p>
+    <w:p>
+      <w:r>
+        <w:t>This is the landing page when the Approver opens "Salary Decisions" from the menu. Lists every salary decision, whatever its status.</w:t>
+      </w:r>
+    </w:p>
+    <w:p>
+      <w:r>
+        <w:t>Each row shows Decision Number, Review Period, Status (Draft, Applied, Cancelled), and Effective Date.</w:t>
+      </w:r>
+    </w:p>
+    <w:p>
+      <w:r>
+        <w:t>Clicking a Draft row reopens it on the Create/Edit Salary Decision screen (Screen 5) with everything previously added still there.</w:t>
+      </w:r>
+    </w:p>
+    <w:p>
+      <w:r>
+        <w:t>Clicking an Applied or Cancelled row opens it in read-only mode; it cannot be edited from here.</w:t>
+      </w:r>
+    </w:p>
+    <w:p>
+      <w:r>
+        <w:t>The "Create New" button requires picking a submitted review period first; only periods without an existing non-cancelled decision are offered.</w:t>
+      </w:r>
+    </w:p>
+    <w:p>
+      <w:r>
+        <w:t>Allows filtering by status and searching by decision number or review period.</w:t>
+      </w:r>
+    </w:p>
+    <w:p>
+      <w:r>
+        <w:t>Related Data/Tables</w:t>
+      </w:r>
+    </w:p>
+    <w:p>
+      <w:r>
+        <w:t>HrSalaryDecision, HrSalaryReviewPeriod</w:t>
+      </w:r>
+    </w:p>
+    <w:p>
       <w:pPr>
         <w:pStyle w:val="Heading1"/>
       </w:pPr>
       <w:r>
-        <w:t>4. Screen 4 - Create/Issue Salary Decision (Approver)</w:t>
+        <w:t>5. Screen 5 - Create/Edit Salary Decision (Approver)</w:t>
       </w:r>
       <w:r/>
       <w:r/>
@@ -444,7 +500,7 @@
     </w:p>
     <w:p>
       <w:r>
-        <w:t>This screen is used by the Approver, after HR Staff has submitted a review period; the Approved Employees list already reflects HR Staff's screening, so no separate review screen is required before drafting the decision.</w:t>
+        <w:t>Reached two ways: (1) from Review Period Detail via "Create Decision" once the period is Submitted — the period is already selected; (2) from the Salary Decision List (Screen 4) via "Create New" — the Approver must first pick a submitted review period without an existing non-cancelled decision. Either way, the Approved Employees list already reflects HR Staff's screening, so no separate review screen is required before drafting the decision.</w:t>
       </w:r>
     </w:p>
     <w:p>
@@ -518,7 +574,7 @@
         <w:pStyle w:val="Heading1"/>
       </w:pPr>
       <w:r>
-        <w:t>5. Screen 5 - Employee Salary History (HR Staff / Approver)</w:t>
+        <w:t>6. Screen 6 - Employee Salary History (HR Staff / Approver)</w:t>
       </w:r>
       <w:r/>
       <w:r/>
@@ -634,7 +690,7 @@
         <w:pStyle w:val="Heading1"/>
       </w:pPr>
       <w:r>
-        <w:t>6. Recommended Navigation Flow</w:t>
+        <w:t>7. Recommended Navigation Flow</w:t>
       </w:r>
     </w:p>
     <w:p>
@@ -644,7 +700,7 @@
     </w:p>
     <w:p>
       <w:r>
-        <w:t>Approver flow (after the review period is submitted): Review Period Details → Create Decision → Issue Decision → Update Salary History.</w:t>
+        <w:t>Approver flow (after the review period is submitted): Review Period Details → Create Decision (or Salary Decision List → Create New, picking the period) → Issue Decision → Update Salary History.</w:t>
       </w:r>
     </w:p>
     <w:p>
@@ -652,7 +708,7 @@
         <w:pStyle w:val="Heading1"/>
       </w:pPr>
       <w:r>
-        <w:t>7. Common UX Rules</w:t>
+        <w:t>8. Common UX Rules</w:t>
       </w:r>
     </w:p>
     <w:p>
@@ -725,7 +781,7 @@
         <w:pStyle w:val="Heading1"/>
       </w:pPr>
       <w:r>
-        <w:t>8. Mapping the 8 Database Tables to the UI</w:t>
+        <w:t>9. Mapping the 8 Database Tables to the UI</w:t>
       </w:r>
     </w:p>
     <w:tbl>

</xml_diff>